<commit_message>
Matching table: the farm barn post has no product yet
Co-Authored-By: Claude Opus 5.5 <noreply@anthropic.com>
Claude-Session: https://claude.ai/code/session_01AQvRoJbu3autEaEnC9DQeD
</commit_message>
<xml_diff>
--- a/docs/Emparejamiento_Instagram.docx
+++ b/docs/Emparejamiento_Instagram.docx
@@ -36,7 +36,7 @@
         <w:pStyle w:val="ListBullet"/>
       </w:pPr>
       <w:r>
-        <w:t>8 hay que verificarlas mirando la foto (dos opciones posibles o texto poco específico).</w:t>
+        <w:t>7 hay que verificarlas mirando la foto (dos opciones posibles o texto poco específico).</w:t>
       </w:r>
     </w:p>
     <w:p>
@@ -44,7 +44,7 @@
         <w:pStyle w:val="ListBullet"/>
       </w:pPr>
       <w:r>
-        <w:t>1 publicación (n.º 8, «crear juguetes con un clic») no tiene un producto seguro en el catálogo: si es una impresora 3D, hay que añadirla.</w:t>
+        <w:t>2 publicaciones no tienen producto en el catálogo y hay que añadirlo: n.º 3 (granero Montessori de tela con animalitos) y n.º 8 («crear juguetes con un clic», posiblemente una impresora 3D).</w:t>
       </w:r>
     </w:p>
     <w:p>
@@ -311,37 +311,37 @@
           </w:tcPr>
           <w:p>
             <w:r>
-              <w:t>Granero Montessori que se transforma</w:t>
-            </w:r>
-          </w:p>
-        </w:tc>
-        <w:tc>
-          <w:tcPr>
-            <w:tcW w:type="dxa" w:w="1440"/>
-          </w:tcPr>
-          <w:p>
-            <w:r>
-              <w:t>Kizfarm – Kit educativo de madera 8 en 1</w:t>
-            </w:r>
-          </w:p>
-        </w:tc>
-        <w:tc>
-          <w:tcPr>
-            <w:tcW w:type="dxa" w:w="1440"/>
-          </w:tcPr>
-          <w:p>
-            <w:r>
-              <w:t>kizfarm</w:t>
-            </w:r>
-          </w:p>
-        </w:tc>
-        <w:tc>
-          <w:tcPr>
-            <w:tcW w:type="dxa" w:w="1440"/>
-          </w:tcPr>
-          <w:p>
-            <w:r>
-              <w:t>Verificar</w:t>
+              <w:t>Granero Montessori de tela que se transforma en alfombra (6 animalitos con sonido)</w:t>
+            </w:r>
+          </w:p>
+        </w:tc>
+        <w:tc>
+          <w:tcPr>
+            <w:tcW w:type="dxa" w:w="1440"/>
+          </w:tcPr>
+          <w:p>
+            <w:r>
+              <w:t>NO ESTÁ en el catálogo: añadirlo con su enlace de Amazon (no es la Kizfarm de madera)</w:t>
+            </w:r>
+          </w:p>
+        </w:tc>
+        <w:tc>
+          <w:tcPr>
+            <w:tcW w:type="dxa" w:w="1440"/>
+          </w:tcPr>
+          <w:p>
+            <w:r>
+              <w:t>granero (después de añadirlo)</w:t>
+            </w:r>
+          </w:p>
+        </w:tc>
+        <w:tc>
+          <w:tcPr>
+            <w:tcW w:type="dxa" w:w="1440"/>
+          </w:tcPr>
+          <w:p>
+            <w:r>
+              <w:t>FALTA</w:t>
             </w:r>
           </w:p>
         </w:tc>

</xml_diff>